<commit_message>
Fix #68/#79: exhibit renumbering sweep across GOAS/FraudGuard exhibits
Renumbered every citation of the old Exhibit 12.4/12.5, G-x, and
12.4.Gx labels to the new flat scheme (Exhibit 27 for FraudGuard, 28 for
GovGuard, with 27.G1-27.G10 / 28.G1-28.G11 sub-exhibit numbering).
Also committing the G1-G10 sub-exhibit document and the Exhibit 12.4
User Summary for the first time (previously untracked).

Co-Authored-By: Claude Sonnet 5 <noreply@anthropic.com>
</commit_message>
<xml_diff>
--- a/LOR/4) Technical Validation Letter on GOAS.docx
+++ b/LOR/4) Technical Validation Letter on GOAS.docx
@@ -172,7 +172,7 @@
         <w:spacing w:before="60" w:after="80"/>
       </w:pPr>
       <w:r>
-        <w:t>Subject: FraudGuard™ v4.1 (Grant Oversight and Analytics System, GOAS V4.1) — Exhibit 12.4; and GovGuard™ — Grant Compliance Platform — Exhibit 12.5</w:t>
+        <w:t>Subject: FraudGuard™ v4.1 (Grant Oversight and Analytics System, GOAS V4.1) — Exhibit 27; and GovGuard™ — Grant Compliance Platform — Exhibit 28</w:t>
       </w:r>
     </w:p>
     <w:p>
@@ -230,7 +230,7 @@
         <w:jc w:val="both"/>
       </w:pPr>
       <w:r>
-        <w:t>I am submitting this letter to provide an independent technical review of two software systems developed by Mr. Muhammad Bilal (FCA, FCCA, CFA) and submitted in support of his EB-2 National Interest Waiver petition: FraudGuard™ v4.1 (Grant Oversight and Analytics System, GOAS V4.1), submitted as Exhibit 12.4, and GovGuard™ — Grant Compliance Platform, submitted as Exhibit 12.5. This letter is organized in two parts, one per system, followed by a combined assessment and recommendations. I have no financial, professional, or personal relationship with the petitioner or with any legal representative involved in this matter, and my assessment is rendered independently and without advocacy.</w:t>
+        <w:t>I am submitting this letter to provide an independent technical review of two software systems developed by Mr. Muhammad Bilal (FCA, FCCA, CFA) and submitted in support of his EB-2 National Interest Waiver petition: FraudGuard™ v4.1 (Grant Oversight and Analytics System, GOAS V4.1), submitted as Exhibit 27, and GovGuard™ — Grant Compliance Platform, submitted as Exhibit 28. This letter is organized in two parts, one per system, followed by a combined assessment and recommendations. I have no financial, professional, or personal relationship with the petitioner or with any legal representative involved in this matter, and my assessment is rendered independently and without advocacy.</w:t>
       </w:r>
     </w:p>
     <w:p>
@@ -269,7 +269,7 @@
         <w:jc w:val="both"/>
       </w:pPr>
       <w:r>
-        <w:t>I have reviewed the following materials submitted by the petitioner. For FraudGuard™ v4.1: Exhibit 12.4, the QA Validation Report, the six test datasets DS1–DS6 (150 transactions, 6 fraud scenarios), and the End-User Testing Manual documenting UI validation across 4 user roles. For GovGuard™: Exhibit 12.5 and its supporting sub-exhibits — G-1 (System Architecture), G-2 (Fraud Detection Rule Library, 47 rules), G-3 (ML Model Documentation), G-4 (GAO Test Dataset Validation, 70 scenarios), G-6 (Code/Algorithms), G-7 (Compliance Rule Engine, 10 rules), and G-9 (Security Architecture). My review was conducted in April 2026.</w:t>
+        <w:t>I have reviewed the following materials submitted by the petitioner. For FraudGuard™ v4.1: Exhibit 27, the QA Validation Report, the six test datasets DS1–DS6 (150 transactions, 6 fraud scenarios), and the End-User Testing Manual documenting UI validation across 4 user roles. For GovGuard™: Exhibit 28 and its supporting sub-exhibits — 28.G1 (System Architecture), 28.G2 (Fraud Detection Rule Library, 47 rules), 28.G3 (ML Model Documentation), 28.G4 (GAO Test Dataset Validation, 70 scenarios), 28.G6 (Code/Algorithms), 28.G7 (Compliance Rule Engine, 10 rules), and 28.G9 (Security Architecture). My review was conducted in April 2026.</w:t>
       </w:r>
     </w:p>
     <w:p>
@@ -282,7 +282,7 @@
         <w:pStyle w:val="Heading1"/>
       </w:pPr>
       <w:r>
-        <w:t>PART I — FraudGuard™ v4.1 (Grant Oversight and Analytics System, GOAS V4.1) — Exhibit 12.4</w:t>
+        <w:t>PART I — FraudGuard™ v4.1 (Grant Oversight and Analytics System, GOAS V4.1) — Exhibit 27</w:t>
       </w:r>
     </w:p>
     <w:p/>
@@ -2351,7 +2351,7 @@
         <w:pStyle w:val="Heading1"/>
       </w:pPr>
       <w:r>
-        <w:t>PART II — GovGuard™ — Grant Compliance Platform — Exhibit 12.5</w:t>
+        <w:t>PART II — GovGuard™ — Grant Compliance Platform — Exhibit 28</w:t>
       </w:r>
     </w:p>
     <w:p/>
@@ -2387,7 +2387,7 @@
     <w:p>
       <w:pPr/>
       <w:r>
-        <w:t>GovGuard™ is architected as a production-ready, cloud-native, multi-tenant Software-as-a-Service platform: a FastAPI (Python 3.12) backend exposing 37 REST API endpoints across 14 feature modules; a Next.js 14 / React 18 / TypeScript frontend; PostgreSQL 17 with Row-Level Security enforcing tenant data isolation at the database layer, not merely the application layer; Redis 7 for caching and task queuing; and Celery-based asynchronous processing for compute-intensive operations (bulk fraud scans, ERP imports, report generation). The platform is currently deployed on Railway (backend) and Vercel (frontend); it is architected for migration to AWS GovCloud (us-gov-west-1 / us-gov-east-1) with FedRAMP Moderate-aligned controls, as detailed in Exhibit G-11 (Enterprise Production Readiness Roadmap). Security controls already in place include AWS KMS encryption at rest for object storage, TLS 1.2+ in transit, and an append-only, cryptographically hash-chained audit_events table that provides a tamper-evident forensic record.</w:t>
+        <w:t>GovGuard™ is architected as a production-ready, cloud-native, multi-tenant Software-as-a-Service platform: a FastAPI (Python 3.12) backend exposing 37 REST API endpoints across 14 feature modules; a Next.js 14 / React 18 / TypeScript frontend; PostgreSQL 17 with Row-Level Security enforcing tenant data isolation at the database layer, not merely the application layer; Redis 7 for caching and task queuing; and Celery-based asynchronous processing for compute-intensive operations (bulk fraud scans, ERP imports, report generation). The platform is currently deployed on Railway (backend) and Vercel (frontend); it is architected for migration to AWS GovCloud (us-gov-west-1 / us-gov-east-1) with FedRAMP Moderate-aligned controls, as detailed in Exhibit 28.G11 (Enterprise Production Readiness Roadmap). Security controls already in place include AWS KMS encryption at rest for object storage, TLS 1.2+ in transit, and an append-only, cryptographically hash-chained audit_events table that provides a tamper-evident forensic record.</w:t>
       </w:r>
     </w:p>
     <w:p/>
@@ -2402,7 +2402,7 @@
     <w:p>
       <w:pPr/>
       <w:r>
-        <w:t>GovGuard™ implements two complementary, independently scored rule engines. The Fraud Detection Engine applies 47 rules (FDE-001–FDE-047) mapped to specific GAO High-Risk program categories. The Compliance Monitor separately applies 10 rules (CM-001–CM-010), each citing a specific 2 CFR Part 200 provision and GAO reference, with automated Corrective Action Plan creation triggered upon MATERIAL_WEAKNESS or SIGNIFICANT_DEFICIENCY findings for the rules so flagged. In the interest of an accurate and complete record, I note that of the 10 compliance rules, 7 (CM-001 through CM-005, CM-007, CM-008) have active evaluation logic in the reviewed build, while the remaining 3 (CM-006, CM-009, CM-010) are fully specified in the rule catalogue — citation, title, and severity — but do not yet have corresponding evaluation logic implemented. This is a normal and disclosed state for a platform at this stage of development and does not detract from the soundness of the architecture; the explicit disclosure of this gap in the petitioner's own exhibit materials (Exhibit G-7) is itself a positive indicator of engineering rigor and intellectual honesty.</w:t>
+        <w:t>GovGuard™ implements two complementary, independently scored rule engines. The Fraud Detection Engine applies 47 rules (FDE-001–FDE-047) mapped to specific GAO High-Risk program categories. The Compliance Monitor separately applies 10 rules (CM-001–CM-010), each citing a specific 2 CFR Part 200 provision and GAO reference, with automated Corrective Action Plan creation triggered upon MATERIAL_WEAKNESS or SIGNIFICANT_DEFICIENCY findings for the rules so flagged. In the interest of an accurate and complete record, I note that of the 10 compliance rules, 7 (CM-001 through CM-005, CM-007, CM-008) have active evaluation logic in the reviewed build, while the remaining 3 (CM-006, CM-009, CM-010) are fully specified in the rule catalogue — citation, title, and severity — but do not yet have corresponding evaluation logic implemented. This is a normal and disclosed state for a platform at this stage of development and does not detract from the soundness of the architecture; the explicit disclosure of this gap in the petitioner's own exhibit materials (Exhibit 28.G7) is itself a positive indicator of engineering rigor and intellectual honesty.</w:t>
       </w:r>
     </w:p>
     <w:p/>
@@ -2432,7 +2432,7 @@
     <w:p>
       <w:pPr/>
       <w:r>
-        <w:t>I have reviewed Exhibit G-9 (Security Architecture) and confirm that the platform's security posture is appropriately mapped to FedRAMP Moderate control families, including AC-2 (Account Management, via AWS Cognito with JWT/RS256 validation), AC-3 (Access Enforcement, via PostgreSQL Row-Level Security), AU-2/AU-9 (Audit Events and Protection of Audit Information, via the hash-chained audit_events table), and SC-28 (Protection of Information at Rest, via AWS KMS). I note one factual correction relative to an earlier exhibit (G-1): PII fields (vendor EIN, address, and user email) are one-way SHA-256 hashed for entity-matching purposes in the current build, rather than the keyed HMAC-SHA256 construction described in that exhibit's summary table. This is a modest but genuine distinction — a keyed HMAC provides materially stronger protection against offline dictionary attacks on these fields than an unkeyed hash — and I recommend the petitioner adopt a keyed HMAC construction as a near-term hardening measure. The distinction does not undermine the overall soundness of the security architecture, which is otherwise well-aligned to FedRAMP Moderate control requirements.</w:t>
+        <w:t>I have reviewed Exhibit 28.G9 (Security Architecture) and confirm that the platform's security posture is appropriately mapped to FedRAMP Moderate control families, including AC-2 (Account Management, via AWS Cognito with JWT/RS256 validation), AC-3 (Access Enforcement, via PostgreSQL Row-Level Security), AU-2/AU-9 (Audit Events and Protection of Audit Information, via the hash-chained audit_events table), and SC-28 (Protection of Information at Rest, via AWS KMS). I note one factual correction relative to an earlier exhibit (28.G1): PII fields (vendor EIN, address, and user email) are one-way SHA-256 hashed for entity-matching purposes in the current build, rather than the keyed HMAC-SHA256 construction described in that exhibit's summary table. This is a modest but genuine distinction — a keyed HMAC provides materially stronger protection against offline dictionary attacks on these fields than an unkeyed hash — and I recommend the petitioner adopt a keyed HMAC construction as a near-term hardening measure. The distinction does not undermine the overall soundness of the security architecture, which is otherwise well-aligned to FedRAMP Moderate control requirements.</w:t>
       </w:r>
     </w:p>
     <w:p/>
@@ -2447,7 +2447,7 @@
     <w:p>
       <w:pPr/>
       <w:r>
-        <w:t>Assessment: GovGuard™ has been validated against a purpose-built 70-scenario test dataset (Exhibit G-4) covering the range of fraud and compliance scenarios documented in GAO High-Risk reporting. This is a materially smaller test corpus than the 150-transaction DS1–DS6 dataset used to validate FraudGuard™ v4.1, and I recommend the petitioner expand this dataset as the platform matures toward a formal Authority to Operate determination. The platform's compilation to a production .next/ frontend build artifact, together with the Docker Compose configuration and prepared AWS GovCloud environment templates reviewed in Exhibit G-1 (migration not yet executed), confirms that this is a deployable, integration-tested platform rather than an isolated research prototype.</w:t>
+        <w:t>Assessment: GovGuard™ has been validated against a purpose-built 70-scenario test dataset (Exhibit 28.G4) covering the range of fraud and compliance scenarios documented in GAO High-Risk reporting. This is a materially smaller test corpus than the 150-transaction DS1–DS6 dataset used to validate FraudGuard™ v4.1, and I recommend the petitioner expand this dataset as the platform matures toward a formal Authority to Operate determination. The platform's compilation to a production .next/ frontend build artifact, together with the Docker Compose configuration and prepared AWS GovCloud environment templates reviewed in Exhibit 28.G1 (migration not yet executed), confirms that this is a deployable, integration-tested platform rather than an isolated research prototype.</w:t>
       </w:r>
     </w:p>
     <w:p/>
@@ -2462,7 +2462,7 @@
     <w:p>
       <w:pPr/>
       <w:r>
-        <w:t>Unlike FraudGuard™ v4.1's browser-deployed, tiered scalability model (Part I, Section V), GovGuard™ is architected from the outset as a multi-tenant, cloud-native production platform, currently running on Railway and Vercel with a clear migration path to AWS GovCloud (Exhibit G-11). PostgreSQL Row-Level Security provides tenant isolation that scales to any number of grantee organizations without per-tenant infrastructure provisioning; Celery-based asynchronous workers absorb compute-intensive operations (bulk fraud scans, ERP synchronization) without blocking the primary API response path; and the planned migration to AWS GovCloud (Exhibit G-11) would provide the FedRAMP Moderate-aligned infrastructure required for federal agency and multi-state deployment. The principal remaining scalability milestone is a formal Authority to Operate determination, which would require the expanded validation dataset noted above and a completed FedRAMP Moderate security assessment.</w:t>
+        <w:t>Unlike FraudGuard™ v4.1's browser-deployed, tiered scalability model (Part I, Section V), GovGuard™ is architected from the outset as a multi-tenant, cloud-native production platform, currently running on Railway and Vercel with a clear migration path to AWS GovCloud (Exhibit 28.G11). PostgreSQL Row-Level Security provides tenant isolation that scales to any number of grantee organizations without per-tenant infrastructure provisioning; Celery-based asynchronous workers absorb compute-intensive operations (bulk fraud scans, ERP synchronization) without blocking the primary API response path; and the planned migration to AWS GovCloud (Exhibit 28.G11) would provide the FedRAMP Moderate-aligned infrastructure required for federal agency and multi-state deployment. The principal remaining scalability milestone is a formal Authority to Operate determination, which would require the expanded validation dataset noted above and a completed FedRAMP Moderate security assessment.</w:t>
       </w:r>
     </w:p>
     <w:p/>

</xml_diff>